<commit_message>
Add articulated ragdolls procedural character animation and deformable snow paths
</commit_message>
<xml_diff>
--- a/docs/Game-Design-Document.docx
+++ b/docs/Game-Design-Document.docx
@@ -64,11 +64,11 @@
     </w:p>
     <w:p>
       <w:r>
-        <w:t>Версия 2.0 • 20 октября 2026</w:t>
+        <w:t>Версия 2.1 • 20 октября 2026</w:t>
         <w:br/>
         <w:t>Unity 6.6 • macOS / Windows</w:t>
         <w:br/>
-        <w:t>Основа: ревизия d12e545</w:t>
+        <w:t>Основа: ревизия 34c147a + итерация ragdoll</w:t>
       </w:r>
     </w:p>
     <w:p>
@@ -78,12 +78,12 @@
     </w:p>
     <w:p>
       <w:r>
-        <w:t>Геймдизайн-документ · версия 2.0 · 20 октября 2026</w:t>
+        <w:t>Геймдизайн-документ · версия 2.1 · 20 октября 2026</w:t>
       </w:r>
     </w:p>
     <w:p>
       <w:r>
-        <w:t>Основа: текущая Unity-реализация, ревизия d12e545. Документ заменяет исходный концепт GDD 1.0 как описание текущих правил. Цели и будущие возможности отмечены отдельно от реализованных механик.</w:t>
+        <w:t>Основа: текущая Unity-реализация, базовая ревизия 34c147a с обновлением ragdoll/протаптывания этой итерации. Документ заменяет исходный концепт GDD 1.0 как описание текущих правил. Цели и будущие возможности отмечены отдельно от реализованных механик.</w:t>
       </w:r>
     </w:p>
     <w:p>
@@ -845,7 +845,7 @@
     </w:p>
     <w:p>
       <w:r>
-        <w:t>Поворот капсулы ограничен для устойчивости. Зимняя одежда и конечности — дочерняя модель из примитивов. Физический суставной ragdoll не реализован: оглушение показывает наклон/качание модели, а сильное попадание — лежащую позу с физическим отбрасыванием.</w:t>
+        <w:t>Поворот капсулы ограничен для устойчивости. Зимняя одежда и конечности — дочерняя модель из примитивов. Суставной ragdoll состоит из 11 Rigidbody и 10 CharacterJoint. Сильные попадания передают управление физическим частям тела; основная капсула временно отключается. Обычное движение, шаги, прыжок и атаки анимируются процедурно. Импортированных Humanoid-клипов пока нет.</w:t>
       </w:r>
     </w:p>
     <w:tbl>
@@ -1625,7 +1625,7 @@
     </w:p>
     <w:p>
       <w:r>
-        <w:t>Ограничение: сетка не деформируется от шагов; новые утоптанные дорожки участники не создают. Отпечатки имеют визуальный характер.</w:t>
+        <w:t>Шаги теперь динамически уплотняют снег: радиус воздействия 0,7 м, снижение глубины до 4,5 см в центре за шаг, остаточная глубина не ниже 4,5 см. Повторные проходы создают более быстрый маршрут. Сетка и MeshCollider обновляются затронутыми участками: 16 участков по 800 треугольников, интервал не менее 0,2 с. Из-за этого физическая поверхность может отставать от поля глубины до следующего обновления. Следы подстраиваются под проседание; новая игра восстанавливает снег. Склон и ледяная вершина не деформируются.</w:t>
       </w:r>
     </w:p>
     <w:p>
@@ -1705,7 +1705,7 @@
     </w:p>
     <w:p>
       <w:r>
-        <w:t>В эти 5 секунд цель лежит, не управляется, не атакует и не получает очки. По окончании возвращается к обычному поведению. Дополнительные удары по лежащему не продлевают эффект и не дают атакующему комбо. Боты могут получать и применять суперснежки по тем же правилам.</w:t>
+        <w:t>В эти 5 секунд цель лежит, не управляется, не атакует и не получает очки. По окончании запускается подъём в свободном месте с опорой и восстановление 0,45 с; если тело ещё в воздухе или место занято, лежание продолжается до безопасного подъёма. Дополнительные удары по лежащему не продлевают эффект и не дают атакующему комбо. Боты могут получать и применять суперснежки по тем же правилам.</w:t>
       </w:r>
     </w:p>
     <w:p>
@@ -1872,7 +1872,7 @@
     </w:p>
     <w:p>
       <w:r>
-        <w:t>Время суток — зимние сумерки. Палитра сочетает холодный сине-серый снег с тёплыми окнами и фонарями. Используются туман, направленный свет и снегопад. Персонажи собраны из примитивов: куртка, шапка с помпоном, шарф, варежки и ботинки. Профессиональные модели и анимационные клипы пока не используются.</w:t>
+        <w:t>Время суток — зимние сумерки. Палитра сочетает холодный сине-серый снег с тёплыми окнами и фонарями. Используются туман, направленный свет и снегопад. Персонажи собраны из примитивов: куртка, шапка с помпоном, шарф, варежки и ботинки. Профессиональные модели и готовые анимационные клипы пока не используются; процедурная анимация суставных частей работает при ходьбе и атаках.</w:t>
       </w:r>
     </w:p>
     <w:p>
@@ -1957,7 +1957,7 @@
     </w:p>
     <w:p>
       <w:r>
-        <w:t>Текущая версия — 3D-прототип с рабочими правилами в исходниках, а не законченный коммерческий релиз. Браузерная версия самостоятельна. В проекте нет мультиплеера, мобильного управления, геймпада, смены дворов, скинов, случайных событий, полноценного ragdoll, деформации снега и записанной озвучки.</w:t>
+        <w:t>Текущая версия — 3D-прототип с рабочими правилами в исходниках, а не законченный коммерческий релиз. Браузерная версия самостоятельна. В проекте нет мультиплеера, мобильного управления, геймпада, смены дворов, скинов, случайных событий, импортированных анимационных клипов и записанной озвучки.</w:t>
       </w:r>
     </w:p>
     <w:p>
@@ -2049,7 +2049,7 @@
                 <w:b w:val="0"/>
                 <w:sz w:val="16"/>
               </w:rPr>
-              <w:t>Fighter</w:t>
+              <w:t>Fighter / CharacterRig</w:t>
             </w:r>
           </w:p>
         </w:tc>
@@ -2063,7 +2063,7 @@
                 <w:b w:val="0"/>
                 <w:sz w:val="16"/>
               </w:rPr>
-              <w:t>Rigidbody, управление, ИИ, удары, очки и визуальная поза</w:t>
+              <w:t>Управление, ИИ, удары, очки, процедурные анимации и суставной ragdoll</w:t>
             </w:r>
           </w:p>
         </w:tc>
@@ -2139,7 +2139,7 @@
                 <w:b w:val="0"/>
                 <w:sz w:val="16"/>
               </w:rPr>
-              <w:t>SnowSurface / SnowFootprints</w:t>
+              <w:t>SnowSurface / SnowDeformation / SnowFootprints</w:t>
             </w:r>
           </w:p>
         </w:tc>
@@ -2153,7 +2153,7 @@
                 <w:b w:val="0"/>
                 <w:sz w:val="16"/>
               </w:rPr>
-              <w:t>Глубина, сетка снега, параметры движения, следы и пыль</w:t>
+              <w:t>Уплотнение, сетка и коллайдеры участков снега, движение, следы и пыль</w:t>
             </w:r>
           </w:p>
         </w:tc>
@@ -2359,7 +2359,7 @@
     </w:p>
     <w:p>
       <w:r>
-        <w:t>В редакторе подготовлены команды Run combat rules checks и Run snow surface checks. Они проверяют правила состояния и параметры поверхности, но не заменяют Play Mode и проверку физических столкновений.</w:t>
+        <w:t>В редакторе подготовлены команды Run combat rules checks и Run snow surface checks, а в Play Mode — Run ragdoll structure checks. Они проверяют правила состояния и параметры поверхности, но не заменяют Play Mode и проверку физических столкновений.</w:t>
       </w:r>
     </w:p>
     <w:p>
@@ -2377,12 +2377,17 @@
     </w:p>
     <w:p>
       <w:r>
-        <w:t>Дальнейшие идеи, не обещания текущей версии: суставной ragdoll, анимированные персонажи, динамическое протаптывание снега, новые дворы, события во дворе и локальный/сетевой мультиплеер.</w:t>
+        <w:t>Дальнейшие идеи, не обещания текущей версии: импортированные персонажи и клипы анимации, улучшение подъёма ragdoll и производительности протаптывания, новые дворы, события во дворе и локальный/сетевой мультиплеер.</w:t>
       </w:r>
     </w:p>
     <w:p>
       <w:r>
         <w:t>Основные риски: долгое оглушение может лишать игрока участия; сильный толчок на льду — слишком далеко уносить; снег — затягивать возвращение; несколько участников на вершине — сокращать матч; простая логика ботов — застревать в окружении. Балансировать следует по игровым сессиям: время возврата, доля времени без управления, средняя длительность матча, частота комбо и доля побед на каждой сложности.</w:t>
+      </w:r>
+    </w:p>
+    <w:p>
+      <w:r>
+        <w:t>Новые механики ragdoll и протаптывания проверены синтаксически, но ещё не запускались в Unity. Приоритет приёмки — устойчивость суставов, подъём у стен и на склоне, очистка физических частей при выходе в меню и нагрузка пересчёта коллайдеров.</w:t>
       </w:r>
     </w:p>
     <w:p>
@@ -2421,7 +2426,7 @@
       <w:pStyle w:val="Footer"/>
     </w:pPr>
     <w:r>
-      <w:t>Царь горы: Зимний двор • GDD 2.0 • MyGame</w:t>
+      <w:t>Царь горы: Зимний двор • GDD 2.1 • MyGame</w:t>
     </w:r>
   </w:p>
 </w:ftr>

</xml_diff>

<commit_message>
Make hill hits trigger low-kick ragdoll rolling down the slope
</commit_message>
<xml_diff>
--- a/docs/Game-Design-Document.docx
+++ b/docs/Game-Design-Document.docx
@@ -64,11 +64,11 @@
     </w:p>
     <w:p>
       <w:r>
-        <w:t>Версия 2.1 • 20 октября 2026</w:t>
+        <w:t>Версия 2.2 • 20 октября 2026</w:t>
         <w:br/>
         <w:t>Unity 6.6 • macOS / Windows</w:t>
         <w:br/>
-        <w:t>Основа: ревизия 34c147a + итерация ragdoll</w:t>
+        <w:t>Основа: ревизия f2b17dc + итерация скатывания</w:t>
       </w:r>
     </w:p>
     <w:p>
@@ -78,12 +78,12 @@
     </w:p>
     <w:p>
       <w:r>
-        <w:t>Геймдизайн-документ · версия 2.1 · 20 октября 2026</w:t>
+        <w:t>Геймдизайн-документ · версия 2.2 · 20 октября 2026</w:t>
       </w:r>
     </w:p>
     <w:p>
       <w:r>
-        <w:t>Основа: текущая Unity-реализация, базовая ревизия 34c147a с обновлением ragdoll/протаптывания этой итерации. Документ заменяет исходный концепт GDD 1.0 как описание текущих правил. Цели и будущие возможности отмечены отдельно от реализованных механик.</w:t>
+        <w:t>Основа: текущая Unity-реализация, базовая ревизия f2b17dc с обновлением скатывания этой итерации. Документ заменяет исходный концепт GDD 1.0 как описание текущих правил. Цели и будущие возможности отмечены отдельно от реализованных механик.</w:t>
       </w:r>
     </w:p>
     <w:p>
@@ -1071,7 +1071,7 @@
     </w:tbl>
     <w:p>
       <w:r>
-        <w:t>Толчок может задеть несколько соперников, но успешное действие даёт один шаг комбо. Цели с оглушением более секунды пропускаются. Дальность отлёта не фиксирована: зависит от массы, исходной скорости, льда, снега, склона и столкновений. Исходная сильная версия толчка восстановлена по запросу автора игры.</w:t>
+        <w:t>Толчок может задеть несколько соперников, но успешное действие даёт один шаг комбо. Цели с оглушением более секунды пропускаются. На ровном дворе сохранён сильный толчок 8/2. На горе удар включает ragdoll со скатыванием: небольшой начальный импульс (не более 3,2 горизонтально и 0,35 вверх), ограниченная унаследованная скорость, вращение и движение под действием тяжести. Помощь скольжению направлена вдоль склона и действует только при контакте с ним. Падение длится не менее 2,2 с; быстро катящееся тело может ждать подъёма до 4,5 с, после чего требуется свободное место с опорой. Суперснежок сохраняет минимум 5 с. Итоговое расстояние зависит от массы, поверхности, склона и столкновений.</w:t>
       </w:r>
     </w:p>
     <w:p>
@@ -2346,7 +2346,7 @@
         <w:pStyle w:val="ListBullet"/>
       </w:pPr>
       <w:r>
-        <w:t>Масса влияет на импульсы; обычный толчок сохранил сильную настройку 8/2.</w:t>
+        <w:t>Масса влияет на импульсы; обычный толчок на ровном дворе сохранил настройку 8/2, а на горе даёт низкий подброс и физическое скатывание.</w:t>
       </w:r>
     </w:p>
     <w:p>
@@ -2426,7 +2426,7 @@
       <w:pStyle w:val="Footer"/>
     </w:pPr>
     <w:r>
-      <w:t>Царь горы: Зимний двор • GDD 2.1 • MyGame</w:t>
+      <w:t>Царь горы: Зимний двор • GDD 2.2 • MyGame</w:t>
     </w:r>
   </w:p>
 </w:ftr>

</xml_diff>

<commit_message>
Add charged catapult-style snowball throws with adjustable ballistic arcs
</commit_message>
<xml_diff>
--- a/docs/Game-Design-Document.docx
+++ b/docs/Game-Design-Document.docx
@@ -64,11 +64,11 @@
     </w:p>
     <w:p>
       <w:r>
-        <w:t>Версия 2.2 • 20 октября 2026</w:t>
+        <w:t>Версия 2.3 • 20 октября 2026</w:t>
         <w:br/>
         <w:t>Unity 6.6 • macOS / Windows</w:t>
         <w:br/>
-        <w:t>Основа: ревизия f2b17dc + итерация скатывания</w:t>
+        <w:t>Основа: ревизия 977db4b + навесной бросок</w:t>
       </w:r>
     </w:p>
     <w:p>
@@ -78,12 +78,12 @@
     </w:p>
     <w:p>
       <w:r>
-        <w:t>Геймдизайн-документ · версия 2.2 · 20 октября 2026</w:t>
+        <w:t>Геймдизайн-документ · версия 2.3 · 20 октября 2026</w:t>
       </w:r>
     </w:p>
     <w:p>
       <w:r>
-        <w:t>Основа: текущая Unity-реализация, базовая ревизия f2b17dc с обновлением скатывания этой итерации. Документ заменяет исходный концепт GDD 1.0 как описание текущих правил. Цели и будущие возможности отмечены отдельно от реализованных механик.</w:t>
+        <w:t>Основа: текущая Unity-реализация, базовая ревизия 977db4b с навесным броском этой итерации. Документ заменяет исходный концепт GDD 1.0 как описание текущих правил. Цели и будущие возможности отмечены отдельно от реализованных механик.</w:t>
       </w:r>
     </w:p>
     <w:p>
@@ -710,7 +710,7 @@
                 <w:b w:val="0"/>
                 <w:sz w:val="16"/>
               </w:rPr>
-              <w:t>ПКМ</w:t>
+              <w:t>Удерживать / отпустить ПКМ</w:t>
             </w:r>
           </w:p>
         </w:tc>
@@ -724,7 +724,7 @@
                 <w:b w:val="0"/>
                 <w:sz w:val="16"/>
               </w:rPr>
-              <w:t>Обычный снежок</w:t>
+              <w:t>Зарядить / бросить обычный снежок навесом</w:t>
             </w:r>
           </w:p>
         </w:tc>
@@ -740,7 +740,7 @@
                 <w:b w:val="0"/>
                 <w:sz w:val="16"/>
               </w:rPr>
-              <w:t>Q</w:t>
+              <w:t>Удерживать / отпустить Q</w:t>
             </w:r>
           </w:p>
         </w:tc>
@@ -754,7 +754,37 @@
                 <w:b w:val="0"/>
                 <w:sz w:val="16"/>
               </w:rPr>
-              <w:t>Суперснежок, когда накоплено комбо и закончена перезарядка</w:t>
+              <w:t>Зарядить / бросить суперснежок, если готов и закончена перезарядка</w:t>
+            </w:r>
+          </w:p>
+        </w:tc>
+      </w:tr>
+      <w:tr>
+        <w:tc>
+          <w:tcPr>
+            <w:tcW w:type="dxa" w:w="4986"/>
+          </w:tcPr>
+          <w:p>
+            <w:r>
+              <w:rPr>
+                <w:b w:val="0"/>
+                <w:sz w:val="16"/>
+              </w:rPr>
+              <w:t>Колесо мыши</w:t>
+            </w:r>
+          </w:p>
+        </w:tc>
+        <w:tc>
+          <w:tcPr>
+            <w:tcW w:type="dxa" w:w="4986"/>
+          </w:tcPr>
+          <w:p>
+            <w:r>
+              <w:rPr>
+                <w:b w:val="0"/>
+                <w:sz w:val="16"/>
+              </w:rPr>
+              <w:t>Угол навесной траектории 30–75°</w:t>
             </w:r>
           </w:p>
         </w:tc>
@@ -822,7 +852,7 @@
     </w:tbl>
     <w:p>
       <w:r>
-        <w:t>Камера находится за персонажем, базовое расстояние — 7 м, поле зрения — 65°. Проверка препятствий приближает камеру при столкновении с окружением. Вертикальный обзор ограничен углами 8–65°. Угол броска пока фиксирован: вертикальный поворот камеры не меняет баллистику снежка. Во время матча курсор захватывается; в меню и паузе освобождается. Потеря фокуса во время активной игры вызывает паузу.</w:t>
+        <w:t>Камера находится за персонажем, базовое расстояние — 7 м, поле зрения — 65°. Проверка препятствий приближает камеру при столкновении с окружением. Вертикальный обзор ограничен углами 8–65°. Угол броска задаётся колесом мыши (30–75°, по умолчанию 55°); вертикальный поворот камеры не меняет баллистику. При зарядке камера плавно отдаляется и расширяет поле зрения для обзора дуги. Во время матча курсор захватывается; в меню и паузе освобождается. Потеря фокуса во время активной игры вызывает паузу.</w:t>
       </w:r>
     </w:p>
     <w:p>
@@ -1643,7 +1673,7 @@
     </w:p>
     <w:p>
       <w:r>
-        <w:t>Снаряд — физическая сфера с Rigidbody, гравитацией и непрерывным обнаружением столкновений. Радиус обычного снежка — 0,12 м. Начальная скорость — 17 по направлению броска плюс 3,2 вверх; срок жизни — до 3 с. Снежок исчезает при столкновении или истечении срока жизни.</w:t>
+        <w:t>Снаряд — физическая сфера с Rigidbody, гравитацией и непрерывным обнаружением столкновений. Радиус обычного снежка — 0,12 м. Удержание кнопки заряжает бросок за 1,2 с. Скорость меняется от 8 до 17 м/с, направление раскладывается на горизонтальную и вертикальную составляющие по выбранному углу 30–75°. Отпускание кнопки выполняет бросок; срок жизни снаряда — до 5 с. Пауза или полученный удар отменяет замах без расхода боеприпаса. Снежок исчезает при столкновении или истечении срока жизни.</w:t>
       </w:r>
     </w:p>
     <w:p>
@@ -1677,12 +1707,12 @@
         <w:pStyle w:val="ListBullet"/>
       </w:pPr>
       <w:r>
-        <w:t>Золотой: доступен суперснежок; прогноз учитывает его больший радиус.</w:t>
+        <w:t>Золотой: игрок удерживает Q для суперснежка; прогноз учитывает больший радиус и силу заряда.</w:t>
       </w:r>
     </w:p>
     <w:p>
       <w:r>
-        <w:t>Даже при золотой дуге ПКМ остаётся обычным броском; суперснежок запускается Q. Прицел скрывается в меню, паузе и при оглушении.</w:t>
+        <w:t>ПКМ всегда заряжает обычный бросок; удержание и отпускание Q — суперснежок. HUD показывает процент заряда и угол дуги. Прицел скрывается в меню, паузе и при оглушении.</w:t>
       </w:r>
     </w:p>
     <w:p>
@@ -1695,7 +1725,7 @@
     </w:p>
     <w:p>
       <w:r>
-        <w:t>Три успешных попадания толчками или обычными снежками заряжают один суперснежок. Между попаданиями допускается не более 6 секунд; каждое попадание обновляет окно. Промах толчком или снежком, истечение окна и полученный удар сбрасывают незавершённую серию. Готовый заряд сохраняется при сбросе серии, не накапливается больше одного и расходуется на бросок Q. Сам суперснежок не создаёт новое комбо.</w:t>
+        <w:t>Три успешных попадания толчками или обычными снежками заряжают один суперснежок. Между попаданиями допускается не более 6 секунд; каждое попадание обновляет окно. Промах толчком или снежком, истечение окна и полученный удар сбрасывают незавершённую серию. Готовый заряд сохраняется при сбросе серии, не накапливается больше одного и расходуется при отпускании Q после зарядки. Сам суперснежок не создаёт новое комбо.</w:t>
       </w:r>
     </w:p>
     <w:p>
@@ -1705,7 +1735,7 @@
     </w:p>
     <w:p>
       <w:r>
-        <w:t>В эти 5 секунд цель лежит, не управляется, не атакует и не получает очки. По окончании запускается подъём в свободном месте с опорой и восстановление 0,45 с; если тело ещё в воздухе или место занято, лежание продолжается до безопасного подъёма. Дополнительные удары по лежащему не продлевают эффект и не дают атакующему комбо. Боты могут получать и применять суперснежки по тем же правилам.</w:t>
+        <w:t>В эти 5 секунд цель лежит, не управляется, не атакует и не получает очки. По окончании запускается подъём в свободном месте с опорой и восстановление 0,45 с; если тело ещё в воздухе или место занято, лежание продолжается до безопасного подъёма. Дополнительные удары по лежащему не продлевают эффект и не дают атакующему комбо. Боты могут получать и применять суперснежки по тем же правилам комбо и перезарядки, а силу навесного броска рассчитывают по дистанции.</w:t>
       </w:r>
     </w:p>
     <w:p>
@@ -2426,7 +2456,7 @@
       <w:pStyle w:val="Footer"/>
     </w:pPr>
     <w:r>
-      <w:t>Царь горы: Зимний двор • GDD 2.2 • MyGame</w:t>
+      <w:t>Царь горы: Зимний двор • GDD 2.3 • MyGame</w:t>
     </w:r>
   </w:p>
 </w:ftr>

</xml_diff>

<commit_message>
Create four Blender character models and bind authored meshes to game rigs
</commit_message>
<xml_diff>
--- a/docs/Game-Design-Document.docx
+++ b/docs/Game-Design-Document.docx
@@ -64,11 +64,11 @@
     </w:p>
     <w:p>
       <w:r>
-        <w:t>Версия 2.3 • 20 октября 2026</w:t>
+        <w:t>Версия 2.4 • 20 октября 2026</w:t>
         <w:br/>
         <w:t>Unity 6.6 • macOS / Windows</w:t>
         <w:br/>
-        <w:t>Основа: ревизия 977db4b + навесной бросок</w:t>
+        <w:t>Основа: ревизия f1445f8 + 3D-модели</w:t>
       </w:r>
     </w:p>
     <w:p>
@@ -78,12 +78,12 @@
     </w:p>
     <w:p>
       <w:r>
-        <w:t>Геймдизайн-документ · версия 2.3 · 20 октября 2026</w:t>
+        <w:t>Геймдизайн-документ · версия 2.4 · 20 октября 2026</w:t>
       </w:r>
     </w:p>
     <w:p>
       <w:r>
-        <w:t>Основа: текущая Unity-реализация, базовая ревизия 977db4b с навесным броском этой итерации. Документ заменяет исходный концепт GDD 1.0 как описание текущих правил. Цели и будущие возможности отмечены отдельно от реализованных механик.</w:t>
+        <w:t>Основа: текущая Unity-реализация, базовая ревизия f1445f8 с четырьмя 3D-моделями этой итерации. Документ заменяет исходный концепт GDD 1.0 как описание текущих правил. Цели и будущие возможности отмечены отдельно от реализованных механик.</w:t>
       </w:r>
     </w:p>
     <w:p>
@@ -875,7 +875,7 @@
     </w:p>
     <w:p>
       <w:r>
-        <w:t>Поворот капсулы ограничен для устойчивости. Зимняя одежда и конечности — дочерняя модель из примитивов. Суставной ragdoll состоит из 11 Rigidbody и 10 CharacterJoint. Сильные попадания передают управление физическим частям тела; основная капсула временно отключается. Обычное движение, шаги, прыжок и атаки анимируются процедурно. Импортированных Humanoid-клипов пока нет.</w:t>
+        <w:t>Поворот капсулы ограничен для устойчивости. Зимняя одежда, лицо и конечности представлены отдельными мешами, созданными в Blender и привязанными к 11 физическим сегментам. Суставной ragdoll состоит из 11 Rigidbody и 10 CharacterJoint. Сильные попадания передают управление физическим частям тела; основная капсула временно отключается. Обычное движение, шаги, прыжок и атаки анимируются процедурно. Импортированных Humanoid-клипов пока нет.</w:t>
       </w:r>
     </w:p>
     <w:tbl>
@@ -1902,7 +1902,7 @@
     </w:p>
     <w:p>
       <w:r>
-        <w:t>Время суток — зимние сумерки. Палитра сочетает холодный сине-серый снег с тёплыми окнами и фонарями. Используются туман, направленный свет и снегопад. Персонажи собраны из примитивов: куртка, шапка с помпоном, шарф, варежки и ботинки. Профессиональные модели и готовые анимационные клипы пока не используются; процедурная анимация суставных частей работает при ходьбе и атаках.</w:t>
+        <w:t>Время суток — зимние сумерки. Палитра сочетает холодный сине-серый снег с тёплыми окнами и фонарями. Используются туман, направленный свет и снегопад. Для четырёх участников созданы отдельные стилизованные модели Blender: игрок в жёлтой куртке, Мишка в красной с ушанкой, Санёк в бирюзовой парке с рыжей шапкой, Димон в фиолетовом с капюшоном. Есть объёмные лица, волосы, швы курток, шарфы, варежки и ботинки. Геометрия — примерно 17,9–22,4 тысячи треугольников на модель. В FBX/GLB есть 11 skin-joints с жёсткими весами; в Unity геометрия загружается из Resources и крепится к сегментам CharacterRig. Готовых анимационных клипов и настроенного Humanoid нет; используется процедурная анимация. Материалы цветовые, без единого текстурного атласа. Стиль проще деталей концепт-иллюстрации.</w:t>
       </w:r>
     </w:p>
     <w:p>
@@ -2079,7 +2079,7 @@
                 <w:b w:val="0"/>
                 <w:sz w:val="16"/>
               </w:rPr>
-              <w:t>Fighter / CharacterRig</w:t>
+              <w:t>Fighter / CharacterRig / CharacterModel</w:t>
             </w:r>
           </w:p>
         </w:tc>
@@ -2430,7 +2430,7 @@
     </w:p>
     <w:p>
       <w:r>
-        <w:t>Источник правил — код папки Unity/Assets/KingOfTheHill/Scripts и актуальный Unity/README.md. Репозиторий: https://github.com/artur23-boop/MyGame. Сгенерированная иллюстрация создана для меню игры; внешние модели и аудиозаписи в текущий комплект не включены.</w:t>
+        <w:t>Источник правил — код папки Unity/Assets/KingOfTheHill/Scripts и актуальный Unity/README.md. Репозиторий: https://github.com/artur23-boop/MyGame. Модели и исходник Blender — в Models/Characters; генератор и проверка экспортов — в tools. Модели отрендерены в Blender, проверена геометрия и структура FBX/GLB. Их отображение в Unity и соответствие анимациям/коллайдерам ещё не подтверждены запуском. Сгенерированная иллюстрация создана для меню игры; сторонние модели и аудиозаписи в текущий комплект не включены; новые модели созданы для этого проекта.</w:t>
       </w:r>
     </w:p>
     <w:p>
@@ -2456,7 +2456,7 @@
       <w:pStyle w:val="Footer"/>
     </w:pPr>
     <w:r>
-      <w:t>Царь горы: Зимний двор • GDD 2.3 • MyGame</w:t>
+      <w:t>Царь горы: Зимний двор • GDD 2.4 • MyGame</w:t>
     </w:r>
   </w:p>
 </w:ftr>

</xml_diff>

<commit_message>
Make hill knockdowns depend on stance and outward impact strength
</commit_message>
<xml_diff>
--- a/docs/Game-Design-Document.docx
+++ b/docs/Game-Design-Document.docx
@@ -64,11 +64,11 @@
     </w:p>
     <w:p>
       <w:r>
-        <w:t>Версия 2.4 • 20 октября 2026</w:t>
+        <w:t>Версия 2.5 • 20 октября 2026</w:t>
         <w:br/>
         <w:t>Unity 6.6 • macOS / Windows</w:t>
         <w:br/>
-        <w:t>Основа: ревизия f1445f8 + 3D-модели</w:t>
+        <w:t>Основа: ревизия ba5572e + баланс устойчивости</w:t>
       </w:r>
     </w:p>
     <w:p>
@@ -78,12 +78,12 @@
     </w:p>
     <w:p>
       <w:r>
-        <w:t>Геймдизайн-документ · версия 2.4 · 20 октября 2026</w:t>
+        <w:t>Геймдизайн-документ · версия 2.5 · 20 октября 2026</w:t>
       </w:r>
     </w:p>
     <w:p>
       <w:r>
-        <w:t>Основа: текущая Unity-реализация, базовая ревизия f1445f8 с четырьмя 3D-моделями этой итерации. Документ заменяет исходный концепт GDD 1.0 как описание текущих правил. Цели и будущие возможности отмечены отдельно от реализованных механик.</w:t>
+        <w:t>Основа: текущая Unity-реализация, базовая ревизия ba5572e с балансом устойчивости этой итерации. Документ заменяет исходный концепт GDD 1.0 как описание текущих правил. Цели и будущие возможности отмечены отдельно от реализованных механик.</w:t>
       </w:r>
     </w:p>
     <w:p>
@@ -1101,7 +1101,7 @@
     </w:tbl>
     <w:p>
       <w:r>
-        <w:t>Толчок может задеть несколько соперников, но успешное действие даёт один шаг комбо. Цели с оглушением более секунды пропускаются. На ровном дворе сохранён сильный толчок 8/2. На горе удар включает ragdoll со скатыванием: небольшой начальный импульс (не более 3,2 горизонтально и 0,35 вверх), ограниченная унаследованная скорость, вращение и движение под действием тяжести. Помощь скольжению направлена вдоль склона и действует только при контакте с ним. Падение длится не менее 2,2 с; быстро катящееся тело может ждать подъёма до 4,5 с, после чего требуется свободное место с опорой. Суперснежок сохраняет минимум 5 с. Итоговое расстояние зависит от массы, поверхности, склона и столкновений.</w:t>
+        <w:t>Толчок может задеть несколько соперников, но успешное действие даёт один шаг комбо. Цели с оглушением более секунды пропускаются. На ровном дворе сохранён сильный толчок 8/2. На горе обычный удар включает ragdoll только при потере устойчивости: радиус от 1,75 м и достаточно сильный импульс наружу с учётом массы и текущего движения (порог проекции impulse/mass + velocity×0,35 равен 7). В центре, при слабом, поперечном или направленном внутрь ударе персонаж лишь сдвигается и оглушается. Сильный снежок в голову и суперснежок продолжают вызывать падение. При скатывании используются: небольшой начальный импульс (не более 3,2 горизонтально и 0,35 вверх), ограниченная унаследованная скорость, вращение и движение под действием тяжести. Помощь скольжению направлена вдоль склона и действует только при контакте с ним. Падение длится не менее 2,2 с; быстро катящееся тело может ждать подъёма до 4,5 с, после чего требуется свободное место с опорой. Суперснежок сохраняет минимум 5 с. Итоговое расстояние зависит от массы, поверхности, склона и столкновений.</w:t>
       </w:r>
     </w:p>
     <w:p>
@@ -2456,7 +2456,7 @@
       <w:pStyle w:val="Footer"/>
     </w:pPr>
     <w:r>
-      <w:t>Царь горы: Зимний двор • GDD 2.4 • MyGame</w:t>
+      <w:t>Царь горы: Зимний двор • GDD 2.5 • MyGame</w:t>
     </w:r>
   </w:p>
 </w:ftr>

</xml_diff>